<commit_message>
Versão final do projeto de treinamento
</commit_message>
<xml_diff>
--- a/template.docx
+++ b/template.docx
@@ -4,7 +4,6 @@
   <w:body>
     <w:p>
       <w:pPr>
-        <w:ind w:left="-1418"/>
         <w:jc w:val="both"/>
         <w:rPr>
           <w:rFonts w:ascii="Arial" w:hAnsi="Arial" w:cs="Arial"/>
@@ -1003,6 +1002,45 @@
       </w:tr>
       <w:tr>
         <w:trPr>
+          <w:trHeight w:val="454"/>
+        </w:trPr>
+        <w:tc>
+          <w:tcPr>
+            <w:tcW w:w="7088" w:type="dxa"/>
+            <w:gridSpan w:val="2"/>
+            <w:vAlign w:val="center"/>
+          </w:tcPr>
+          <w:p>
+            <w:pPr>
+              <w:jc w:val="center"/>
+              <w:rPr>
+                <w:rFonts w:ascii="Calibri" w:hAnsi="Calibri" w:cs="Calibri"/>
+                <w:sz w:val="20"/>
+                <w:szCs w:val="20"/>
+              </w:rPr>
+            </w:pPr>
+          </w:p>
+        </w:tc>
+        <w:tc>
+          <w:tcPr>
+            <w:tcW w:w="3402" w:type="dxa"/>
+            <w:gridSpan w:val="4"/>
+            <w:vAlign w:val="center"/>
+          </w:tcPr>
+          <w:p>
+            <w:pPr>
+              <w:jc w:val="center"/>
+              <w:rPr>
+                <w:rFonts w:ascii="Calibri" w:hAnsi="Calibri" w:cs="Calibri"/>
+                <w:sz w:val="20"/>
+                <w:szCs w:val="20"/>
+              </w:rPr>
+            </w:pPr>
+          </w:p>
+        </w:tc>
+      </w:tr>
+      <w:tr>
+        <w:trPr>
           <w:cantSplit/>
           <w:trHeight w:val="607"/>
         </w:trPr>
@@ -1034,6 +1072,16 @@
               </w:rPr>
               <w:t>CRITÉRIOS DE AVALIAÇÃO</w:t>
             </w:r>
+            <w:r>
+              <w:rPr>
+                <w:rFonts w:ascii="Arial" w:hAnsi="Arial" w:cs="Arial"/>
+                <w:b/>
+                <w:color w:val="FFFFFF" w:themeColor="background1"/>
+                <w:sz w:val="20"/>
+                <w:szCs w:val="20"/>
+              </w:rPr>
+              <w:t>(GESTOR)</w:t>
+            </w:r>
           </w:p>
         </w:tc>
         <w:tc>
@@ -1092,97 +1140,6 @@
               </w:rPr>
               <w:t>Não?</w:t>
             </w:r>
-          </w:p>
-        </w:tc>
-      </w:tr>
-      <w:tr>
-        <w:trPr>
-          <w:trHeight w:val="372"/>
-        </w:trPr>
-        <w:tc>
-          <w:tcPr>
-            <w:tcW w:w="9073" w:type="dxa"/>
-            <w:gridSpan w:val="4"/>
-            <w:vAlign w:val="center"/>
-          </w:tcPr>
-          <w:p>
-            <w:pPr>
-              <w:ind w:left="360"/>
-              <w:rPr>
-                <w:rFonts w:ascii="Arial" w:hAnsi="Arial" w:cs="Arial"/>
-                <w:bCs/>
-                <w:sz w:val="20"/>
-                <w:szCs w:val="20"/>
-              </w:rPr>
-            </w:pPr>
-          </w:p>
-          <w:p>
-            <w:pPr>
-              <w:numPr>
-                <w:ilvl w:val="0"/>
-                <w:numId w:val="1"/>
-              </w:numPr>
-              <w:rPr>
-                <w:rFonts w:ascii="Arial" w:hAnsi="Arial" w:cs="Arial"/>
-                <w:b/>
-                <w:bCs/>
-                <w:sz w:val="20"/>
-                <w:szCs w:val="20"/>
-              </w:rPr>
-            </w:pPr>
-            <w:r>
-              <w:rPr>
-                <w:rFonts w:ascii="Arial" w:hAnsi="Arial" w:cs="Arial"/>
-                <w:b/>
-                <w:bCs/>
-                <w:sz w:val="20"/>
-                <w:szCs w:val="20"/>
-              </w:rPr>
-              <w:t>A ação de desenvolvimento e/ou treinamento atendeu ao objetivo pelo qual o participante foi inscrito?</w:t>
-            </w:r>
-          </w:p>
-          <w:p>
-            <w:pPr>
-              <w:ind w:left="360"/>
-              <w:rPr>
-                <w:rFonts w:ascii="Arial" w:hAnsi="Arial" w:cs="Arial"/>
-                <w:bCs/>
-                <w:sz w:val="20"/>
-                <w:szCs w:val="20"/>
-              </w:rPr>
-            </w:pPr>
-          </w:p>
-        </w:tc>
-        <w:tc>
-          <w:tcPr>
-            <w:tcW w:w="708" w:type="dxa"/>
-            <w:vAlign w:val="center"/>
-          </w:tcPr>
-          <w:p>
-            <w:pPr>
-              <w:jc w:val="center"/>
-              <w:rPr>
-                <w:rFonts w:ascii="Arial" w:hAnsi="Arial" w:cs="Arial"/>
-                <w:sz w:val="20"/>
-                <w:szCs w:val="20"/>
-              </w:rPr>
-            </w:pPr>
-          </w:p>
-        </w:tc>
-        <w:tc>
-          <w:tcPr>
-            <w:tcW w:w="709" w:type="dxa"/>
-            <w:vAlign w:val="center"/>
-          </w:tcPr>
-          <w:p>
-            <w:pPr>
-              <w:jc w:val="center"/>
-              <w:rPr>
-                <w:rFonts w:ascii="Arial" w:hAnsi="Arial" w:cs="Arial"/>
-                <w:sz w:val="20"/>
-                <w:szCs w:val="20"/>
-              </w:rPr>
-            </w:pPr>
           </w:p>
         </w:tc>
       </w:tr>
@@ -1459,307 +1416,6 @@
           <w:p>
             <w:pPr>
               <w:jc w:val="center"/>
-              <w:rPr>
-                <w:rFonts w:ascii="Arial" w:hAnsi="Arial" w:cs="Arial"/>
-                <w:bCs/>
-                <w:sz w:val="20"/>
-                <w:szCs w:val="20"/>
-              </w:rPr>
-            </w:pPr>
-          </w:p>
-        </w:tc>
-      </w:tr>
-      <w:tr>
-        <w:trPr>
-          <w:trHeight w:val="363"/>
-        </w:trPr>
-        <w:tc>
-          <w:tcPr>
-            <w:tcW w:w="9073" w:type="dxa"/>
-            <w:gridSpan w:val="4"/>
-            <w:vMerge w:val="restart"/>
-            <w:tcBorders>
-              <w:top w:val="single" w:sz="4" w:space="0" w:color="auto"/>
-            </w:tcBorders>
-            <w:vAlign w:val="center"/>
-          </w:tcPr>
-          <w:p>
-            <w:pPr>
-              <w:numPr>
-                <w:ilvl w:val="0"/>
-                <w:numId w:val="1"/>
-              </w:numPr>
-              <w:jc w:val="both"/>
-              <w:rPr>
-                <w:rFonts w:ascii="Arial" w:hAnsi="Arial" w:cs="Arial"/>
-                <w:b/>
-                <w:sz w:val="20"/>
-                <w:szCs w:val="20"/>
-              </w:rPr>
-            </w:pPr>
-            <w:r>
-              <w:rPr>
-                <w:rFonts w:ascii="Arial" w:hAnsi="Arial" w:cs="Arial"/>
-                <w:b/>
-                <w:bCs/>
-                <w:sz w:val="20"/>
-                <w:szCs w:val="20"/>
-              </w:rPr>
-              <w:t xml:space="preserve">O conhecimento adquirido durante a ação de desenvolvimento e/ou treinamento está proporcionando melhorias das atividades? </w:t>
-            </w:r>
-          </w:p>
-        </w:tc>
-        <w:tc>
-          <w:tcPr>
-            <w:tcW w:w="708" w:type="dxa"/>
-            <w:vAlign w:val="center"/>
-          </w:tcPr>
-          <w:p>
-            <w:pPr>
-              <w:jc w:val="center"/>
-              <w:rPr>
-                <w:rFonts w:ascii="Arial" w:hAnsi="Arial" w:cs="Arial"/>
-                <w:b/>
-                <w:sz w:val="20"/>
-                <w:szCs w:val="20"/>
-              </w:rPr>
-            </w:pPr>
-            <w:r>
-              <w:rPr>
-                <w:rFonts w:ascii="Arial" w:hAnsi="Arial" w:cs="Arial"/>
-                <w:b/>
-                <w:sz w:val="20"/>
-                <w:szCs w:val="20"/>
-              </w:rPr>
-              <w:t>Sim?</w:t>
-            </w:r>
-          </w:p>
-        </w:tc>
-        <w:tc>
-          <w:tcPr>
-            <w:tcW w:w="709" w:type="dxa"/>
-            <w:vAlign w:val="center"/>
-          </w:tcPr>
-          <w:p>
-            <w:pPr>
-              <w:jc w:val="center"/>
-              <w:rPr>
-                <w:rFonts w:ascii="Arial" w:hAnsi="Arial" w:cs="Arial"/>
-                <w:b/>
-                <w:sz w:val="20"/>
-                <w:szCs w:val="20"/>
-              </w:rPr>
-            </w:pPr>
-            <w:r>
-              <w:rPr>
-                <w:rFonts w:ascii="Arial" w:hAnsi="Arial" w:cs="Arial"/>
-                <w:b/>
-                <w:sz w:val="20"/>
-                <w:szCs w:val="20"/>
-              </w:rPr>
-              <w:t>Não?</w:t>
-            </w:r>
-          </w:p>
-        </w:tc>
-      </w:tr>
-      <w:tr>
-        <w:trPr>
-          <w:trHeight w:val="479"/>
-        </w:trPr>
-        <w:tc>
-          <w:tcPr>
-            <w:tcW w:w="9073" w:type="dxa"/>
-            <w:gridSpan w:val="4"/>
-            <w:vMerge/>
-            <w:tcBorders>
-              <w:bottom w:val="single" w:sz="4" w:space="0" w:color="auto"/>
-            </w:tcBorders>
-            <w:vAlign w:val="center"/>
-          </w:tcPr>
-          <w:p>
-            <w:pPr>
-              <w:numPr>
-                <w:ilvl w:val="0"/>
-                <w:numId w:val="1"/>
-              </w:numPr>
-              <w:jc w:val="both"/>
-              <w:rPr>
-                <w:rFonts w:ascii="Arial" w:hAnsi="Arial" w:cs="Arial"/>
-                <w:bCs/>
-                <w:sz w:val="20"/>
-                <w:szCs w:val="20"/>
-              </w:rPr>
-            </w:pPr>
-          </w:p>
-        </w:tc>
-        <w:tc>
-          <w:tcPr>
-            <w:tcW w:w="708" w:type="dxa"/>
-            <w:tcBorders>
-              <w:bottom w:val="dashed" w:sz="4" w:space="0" w:color="auto"/>
-            </w:tcBorders>
-            <w:vAlign w:val="center"/>
-          </w:tcPr>
-          <w:p>
-            <w:pPr>
-              <w:jc w:val="center"/>
-              <w:rPr>
-                <w:rFonts w:ascii="Arial" w:hAnsi="Arial" w:cs="Arial"/>
-                <w:sz w:val="20"/>
-                <w:szCs w:val="20"/>
-              </w:rPr>
-            </w:pPr>
-          </w:p>
-        </w:tc>
-        <w:tc>
-          <w:tcPr>
-            <w:tcW w:w="709" w:type="dxa"/>
-            <w:tcBorders>
-              <w:bottom w:val="dashed" w:sz="4" w:space="0" w:color="auto"/>
-            </w:tcBorders>
-            <w:vAlign w:val="center"/>
-          </w:tcPr>
-          <w:p>
-            <w:pPr>
-              <w:jc w:val="center"/>
-              <w:rPr>
-                <w:rFonts w:ascii="Arial" w:hAnsi="Arial" w:cs="Arial"/>
-                <w:sz w:val="20"/>
-                <w:szCs w:val="20"/>
-              </w:rPr>
-            </w:pPr>
-          </w:p>
-        </w:tc>
-      </w:tr>
-      <w:tr>
-        <w:trPr>
-          <w:trHeight w:val="1393"/>
-        </w:trPr>
-        <w:tc>
-          <w:tcPr>
-            <w:tcW w:w="10490" w:type="dxa"/>
-            <w:gridSpan w:val="6"/>
-            <w:tcBorders>
-              <w:top w:val="single" w:sz="4" w:space="0" w:color="auto"/>
-              <w:bottom w:val="single" w:sz="4" w:space="0" w:color="auto"/>
-            </w:tcBorders>
-          </w:tcPr>
-          <w:p>
-            <w:pPr>
-              <w:pBdr>
-                <w:top w:val="dashed" w:sz="4" w:space="1" w:color="auto"/>
-              </w:pBdr>
-              <w:rPr>
-                <w:rFonts w:ascii="Arial" w:hAnsi="Arial" w:cs="Arial"/>
-                <w:bCs/>
-                <w:sz w:val="20"/>
-                <w:szCs w:val="20"/>
-              </w:rPr>
-            </w:pPr>
-            <w:r>
-              <w:rPr>
-                <w:rFonts w:ascii="Arial" w:hAnsi="Arial" w:cs="Arial"/>
-                <w:b/>
-                <w:bCs/>
-                <w:sz w:val="20"/>
-                <w:szCs w:val="20"/>
-              </w:rPr>
-              <w:t>Caso a sua resposta anterior tenha sido “não”, justifique</w:t>
-            </w:r>
-            <w:r>
-              <w:rPr>
-                <w:rFonts w:ascii="Arial" w:hAnsi="Arial" w:cs="Arial"/>
-                <w:bCs/>
-                <w:sz w:val="20"/>
-                <w:szCs w:val="20"/>
-              </w:rPr>
-              <w:t xml:space="preserve">: </w:t>
-            </w:r>
-          </w:p>
-          <w:p>
-            <w:pPr>
-              <w:pBdr>
-                <w:top w:val="dashed" w:sz="4" w:space="1" w:color="auto"/>
-              </w:pBdr>
-              <w:rPr>
-                <w:rFonts w:ascii="Arial" w:hAnsi="Arial" w:cs="Arial"/>
-                <w:bCs/>
-                <w:sz w:val="20"/>
-                <w:szCs w:val="20"/>
-              </w:rPr>
-            </w:pPr>
-          </w:p>
-          <w:p>
-            <w:pPr>
-              <w:pBdr>
-                <w:top w:val="dashed" w:sz="4" w:space="1" w:color="auto"/>
-              </w:pBdr>
-              <w:rPr>
-                <w:rFonts w:ascii="Arial" w:hAnsi="Arial" w:cs="Arial"/>
-                <w:b/>
-                <w:sz w:val="20"/>
-                <w:szCs w:val="20"/>
-              </w:rPr>
-            </w:pPr>
-          </w:p>
-          <w:p>
-            <w:pPr>
-              <w:pStyle w:val="PargrafodaLista"/>
-              <w:numPr>
-                <w:ilvl w:val="0"/>
-                <w:numId w:val="1"/>
-              </w:numPr>
-              <w:pBdr>
-                <w:top w:val="dashed" w:sz="4" w:space="1" w:color="auto"/>
-              </w:pBdr>
-              <w:rPr>
-                <w:rFonts w:ascii="Arial" w:hAnsi="Arial" w:cs="Arial"/>
-                <w:b/>
-                <w:sz w:val="20"/>
-                <w:szCs w:val="20"/>
-              </w:rPr>
-            </w:pPr>
-            <w:r>
-              <w:rPr>
-                <w:rFonts w:ascii="Arial" w:hAnsi="Arial" w:cs="Arial"/>
-                <w:b/>
-                <w:sz w:val="20"/>
-                <w:szCs w:val="20"/>
-              </w:rPr>
-              <w:t xml:space="preserve">Data de realização da Eficácia: </w:t>
-            </w:r>
-          </w:p>
-          <w:p>
-            <w:pPr>
-              <w:pBdr>
-                <w:top w:val="dashed" w:sz="4" w:space="1" w:color="auto"/>
-              </w:pBdr>
-              <w:rPr>
-                <w:rFonts w:ascii="Arial" w:hAnsi="Arial" w:cs="Arial"/>
-                <w:bCs/>
-                <w:sz w:val="20"/>
-                <w:szCs w:val="20"/>
-              </w:rPr>
-            </w:pPr>
-          </w:p>
-          <w:p>
-            <w:pPr>
-              <w:pBdr>
-                <w:top w:val="dashed" w:sz="4" w:space="1" w:color="auto"/>
-              </w:pBdr>
-              <w:rPr>
-                <w:rFonts w:ascii="Arial" w:hAnsi="Arial" w:cs="Arial"/>
-                <w:bCs/>
-                <w:sz w:val="20"/>
-                <w:szCs w:val="20"/>
-              </w:rPr>
-            </w:pPr>
-          </w:p>
-          <w:p>
-            <w:pPr>
-              <w:pBdr>
-                <w:top w:val="dashed" w:sz="4" w:space="1" w:color="auto"/>
-              </w:pBdr>
               <w:rPr>
                 <w:rFonts w:ascii="Arial" w:hAnsi="Arial" w:cs="Arial"/>
                 <w:bCs/>
@@ -1796,14 +1452,82 @@
           <w:szCs w:val="20"/>
         </w:rPr>
       </w:pPr>
+      <w:r>
+        <w:rPr>
+          <w:rFonts w:ascii="Arial" w:hAnsi="Arial" w:cs="Arial"/>
+          <w:bCs/>
+          <w:noProof/>
+          <w:sz w:val="20"/>
+          <w:szCs w:val="20"/>
+        </w:rPr>
+        <mc:AlternateContent>
+          <mc:Choice Requires="wps">
+            <w:drawing>
+              <wp:anchor distT="0" distB="0" distL="114300" distR="114300" simplePos="0" relativeHeight="251659264" behindDoc="0" locked="0" layoutInCell="1" allowOverlap="1" wp14:anchorId="29FE0557" wp14:editId="459D2BE7">
+                <wp:simplePos x="0" y="0"/>
+                <wp:positionH relativeFrom="column">
+                  <wp:posOffset>1634490</wp:posOffset>
+                </wp:positionH>
+                <wp:positionV relativeFrom="paragraph">
+                  <wp:posOffset>775335</wp:posOffset>
+                </wp:positionV>
+                <wp:extent cx="2362200" cy="9525"/>
+                <wp:effectExtent l="0" t="0" r="19050" b="28575"/>
+                <wp:wrapNone/>
+                <wp:docPr id="1715920819" name="Conector reto 1"/>
+                <wp:cNvGraphicFramePr/>
+                <a:graphic xmlns:a="http://schemas.openxmlformats.org/drawingml/2006/main">
+                  <a:graphicData uri="http://schemas.microsoft.com/office/word/2010/wordprocessingShape">
+                    <wps:wsp>
+                      <wps:cNvCnPr/>
+                      <wps:spPr>
+                        <a:xfrm>
+                          <a:off x="0" y="0"/>
+                          <a:ext cx="2362200" cy="9525"/>
+                        </a:xfrm>
+                        <a:prstGeom prst="line">
+                          <a:avLst/>
+                        </a:prstGeom>
+                      </wps:spPr>
+                      <wps:style>
+                        <a:lnRef idx="1">
+                          <a:schemeClr val="dk1"/>
+                        </a:lnRef>
+                        <a:fillRef idx="0">
+                          <a:schemeClr val="dk1"/>
+                        </a:fillRef>
+                        <a:effectRef idx="0">
+                          <a:schemeClr val="dk1"/>
+                        </a:effectRef>
+                        <a:fontRef idx="minor">
+                          <a:schemeClr val="tx1"/>
+                        </a:fontRef>
+                      </wps:style>
+                      <wps:bodyPr/>
+                    </wps:wsp>
+                  </a:graphicData>
+                </a:graphic>
+                <wp14:sizeRelH relativeFrom="margin">
+                  <wp14:pctWidth>0</wp14:pctWidth>
+                </wp14:sizeRelH>
+                <wp14:sizeRelV relativeFrom="margin">
+                  <wp14:pctHeight>0</wp14:pctHeight>
+                </wp14:sizeRelV>
+              </wp:anchor>
+            </w:drawing>
+          </mc:Choice>
+          <mc:Fallback>
+            <w:pict>
+              <v:line w14:anchorId="5F10C268" id="Conector reto 1" o:spid="_x0000_s1026" style="position:absolute;z-index:251659264;visibility:visible;mso-wrap-style:square;mso-width-percent:0;mso-height-percent:0;mso-wrap-distance-left:9pt;mso-wrap-distance-top:0;mso-wrap-distance-right:9pt;mso-wrap-distance-bottom:0;mso-position-horizontal:absolute;mso-position-horizontal-relative:text;mso-position-vertical:absolute;mso-position-vertical-relative:text;mso-width-percent:0;mso-height-percent:0;mso-width-relative:margin;mso-height-relative:margin" from="128.7pt,61.05pt" to="314.7pt,61.8pt" o:gfxdata="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" strokecolor="black [3200]" strokeweight=".5pt">
+                <v:stroke joinstyle="miter"/>
+              </v:line>
+            </w:pict>
+          </mc:Fallback>
+        </mc:AlternateContent>
+      </w:r>
     </w:p>
     <w:sectPr>
-      <w:headerReference w:type="even" r:id="rId11"/>
-      <w:headerReference w:type="default" r:id="rId12"/>
-      <w:footerReference w:type="even" r:id="rId13"/>
-      <w:footerReference w:type="default" r:id="rId14"/>
-      <w:headerReference w:type="first" r:id="rId15"/>
-      <w:footerReference w:type="first" r:id="rId16"/>
+      <w:headerReference w:type="default" r:id="rId11"/>
       <w:pgSz w:w="12240" w:h="15840"/>
       <w:pgMar w:top="851" w:right="333" w:bottom="851" w:left="1701" w:header="708" w:footer="708" w:gutter="0"/>
       <w:cols w:space="708"/>
@@ -1832,36 +1556,6 @@
 </w:endnotes>
 </file>
 
-<file path=word/footer1.xml><?xml version="1.0" encoding="utf-8"?>
-<w:ftr xmlns:wpc="http://schemas.microsoft.com/office/word/2010/wordprocessingCanvas" xmlns:cx="http://schemas.microsoft.com/office/drawing/2014/chartex" xmlns:cx1="http://schemas.microsoft.com/office/drawing/2015/9/8/chartex" xmlns:cx2="http://schemas.microsoft.com/office/drawing/2015/10/21/chartex" xmlns:cx3="http://schemas.microsoft.com/office/drawing/2016/5/9/chartex" xmlns:cx4="http://schemas.microsoft.com/office/drawing/2016/5/10/chartex" xmlns:cx5="http://schemas.microsoft.com/office/drawing/2016/5/11/chartex" xmlns:cx6="http://schemas.microsoft.com/office/drawing/2016/5/12/chartex" xmlns:cx7="http://schemas.microsoft.com/office/drawing/2016/5/13/chartex" xmlns:cx8="http://schemas.microsoft.com/office/drawing/2016/5/14/chartex" xmlns:mc="http://schemas.openxmlformats.org/markup-compatibility/2006" xmlns:aink="http://schemas.microsoft.com/office/drawing/2016/ink" xmlns:am3d="http://schemas.microsoft.com/office/drawing/2017/model3d" xmlns:o="urn:schemas-microsoft-com:office:office" xmlns:oel="http://schemas.microsoft.com/office/2019/extlst" xmlns:r="http://schemas.openxmlformats.org/officeDocument/2006/relationships" xmlns:m="http://schemas.openxmlformats.org/officeDocument/2006/math" xmlns:v="urn:schemas-microsoft-com:vml" xmlns:wp14="http://schemas.microsoft.com/office/word/2010/wordprocessingDrawing" xmlns:wp="http://schemas.openxmlformats.org/drawingml/2006/wordprocessingDrawing" xmlns:w10="urn:schemas-microsoft-com:office:word" xmlns:w="http://schemas.openxmlformats.org/wordprocessingml/2006/main" xmlns:w14="http://schemas.microsoft.com/office/word/2010/wordml" xmlns:w15="http://schemas.microsoft.com/office/word/2012/wordml" xmlns:w16cex="http://schemas.microsoft.com/office/word/2018/wordml/cex" xmlns:w16cid="http://schemas.microsoft.com/office/word/2016/wordml/cid" xmlns:w16="http://schemas.microsoft.com/office/word/2018/wordml" xmlns:w16du="http://schemas.microsoft.com/office/word/2023/wordml/word16du" xmlns:w16sdtdh="http://schemas.microsoft.com/office/word/2020/wordml/sdtdatahash" xmlns:w16sdtfl="http://schemas.microsoft.com/office/word/2024/wordml/sdtformatlock" xmlns:w16se="http://schemas.microsoft.com/office/word/2015/wordml/symex" xmlns:wpg="http://schemas.microsoft.com/office/word/2010/wordprocessingGroup" xmlns:wpi="http://schemas.microsoft.com/office/word/2010/wordprocessingInk" xmlns:wne="http://schemas.microsoft.com/office/word/2006/wordml" xmlns:wps="http://schemas.microsoft.com/office/word/2010/wordprocessingShape" mc:Ignorable="w14 w15 w16se w16cid w16 w16cex w16sdtdh w16sdtfl w16du wp14">
-  <w:p>
-    <w:pPr>
-      <w:pStyle w:val="Rodap"/>
-    </w:pPr>
-  </w:p>
-</w:ftr>
-</file>
-
-<file path=word/footer2.xml><?xml version="1.0" encoding="utf-8"?>
-<w:ftr xmlns:wpc="http://schemas.microsoft.com/office/word/2010/wordprocessingCanvas" xmlns:cx="http://schemas.microsoft.com/office/drawing/2014/chartex" xmlns:cx1="http://schemas.microsoft.com/office/drawing/2015/9/8/chartex" xmlns:cx2="http://schemas.microsoft.com/office/drawing/2015/10/21/chartex" xmlns:cx3="http://schemas.microsoft.com/office/drawing/2016/5/9/chartex" xmlns:cx4="http://schemas.microsoft.com/office/drawing/2016/5/10/chartex" xmlns:cx5="http://schemas.microsoft.com/office/drawing/2016/5/11/chartex" xmlns:cx6="http://schemas.microsoft.com/office/drawing/2016/5/12/chartex" xmlns:cx7="http://schemas.microsoft.com/office/drawing/2016/5/13/chartex" xmlns:cx8="http://schemas.microsoft.com/office/drawing/2016/5/14/chartex" xmlns:mc="http://schemas.openxmlformats.org/markup-compatibility/2006" xmlns:aink="http://schemas.microsoft.com/office/drawing/2016/ink" xmlns:am3d="http://schemas.microsoft.com/office/drawing/2017/model3d" xmlns:o="urn:schemas-microsoft-com:office:office" xmlns:oel="http://schemas.microsoft.com/office/2019/extlst" xmlns:r="http://schemas.openxmlformats.org/officeDocument/2006/relationships" xmlns:m="http://schemas.openxmlformats.org/officeDocument/2006/math" xmlns:v="urn:schemas-microsoft-com:vml" xmlns:wp14="http://schemas.microsoft.com/office/word/2010/wordprocessingDrawing" xmlns:wp="http://schemas.openxmlformats.org/drawingml/2006/wordprocessingDrawing" xmlns:w10="urn:schemas-microsoft-com:office:word" xmlns:w="http://schemas.openxmlformats.org/wordprocessingml/2006/main" xmlns:w14="http://schemas.microsoft.com/office/word/2010/wordml" xmlns:w15="http://schemas.microsoft.com/office/word/2012/wordml" xmlns:w16cex="http://schemas.microsoft.com/office/word/2018/wordml/cex" xmlns:w16cid="http://schemas.microsoft.com/office/word/2016/wordml/cid" xmlns:w16="http://schemas.microsoft.com/office/word/2018/wordml" xmlns:w16du="http://schemas.microsoft.com/office/word/2023/wordml/word16du" xmlns:w16sdtdh="http://schemas.microsoft.com/office/word/2020/wordml/sdtdatahash" xmlns:w16sdtfl="http://schemas.microsoft.com/office/word/2024/wordml/sdtformatlock" xmlns:w16se="http://schemas.microsoft.com/office/word/2015/wordml/symex" xmlns:wpg="http://schemas.microsoft.com/office/word/2010/wordprocessingGroup" xmlns:wpi="http://schemas.microsoft.com/office/word/2010/wordprocessingInk" xmlns:wne="http://schemas.microsoft.com/office/word/2006/wordml" xmlns:wps="http://schemas.microsoft.com/office/word/2010/wordprocessingShape" mc:Ignorable="w14 w15 w16se w16cid w16 w16cex w16sdtdh w16sdtfl w16du wp14">
-  <w:p>
-    <w:pPr>
-      <w:pStyle w:val="Rodap"/>
-    </w:pPr>
-  </w:p>
-</w:ftr>
-</file>
-
-<file path=word/footer3.xml><?xml version="1.0" encoding="utf-8"?>
-<w:ftr xmlns:wpc="http://schemas.microsoft.com/office/word/2010/wordprocessingCanvas" xmlns:cx="http://schemas.microsoft.com/office/drawing/2014/chartex" xmlns:cx1="http://schemas.microsoft.com/office/drawing/2015/9/8/chartex" xmlns:cx2="http://schemas.microsoft.com/office/drawing/2015/10/21/chartex" xmlns:cx3="http://schemas.microsoft.com/office/drawing/2016/5/9/chartex" xmlns:cx4="http://schemas.microsoft.com/office/drawing/2016/5/10/chartex" xmlns:cx5="http://schemas.microsoft.com/office/drawing/2016/5/11/chartex" xmlns:cx6="http://schemas.microsoft.com/office/drawing/2016/5/12/chartex" xmlns:cx7="http://schemas.microsoft.com/office/drawing/2016/5/13/chartex" xmlns:cx8="http://schemas.microsoft.com/office/drawing/2016/5/14/chartex" xmlns:mc="http://schemas.openxmlformats.org/markup-compatibility/2006" xmlns:aink="http://schemas.microsoft.com/office/drawing/2016/ink" xmlns:am3d="http://schemas.microsoft.com/office/drawing/2017/model3d" xmlns:o="urn:schemas-microsoft-com:office:office" xmlns:oel="http://schemas.microsoft.com/office/2019/extlst" xmlns:r="http://schemas.openxmlformats.org/officeDocument/2006/relationships" xmlns:m="http://schemas.openxmlformats.org/officeDocument/2006/math" xmlns:v="urn:schemas-microsoft-com:vml" xmlns:wp14="http://schemas.microsoft.com/office/word/2010/wordprocessingDrawing" xmlns:wp="http://schemas.openxmlformats.org/drawingml/2006/wordprocessingDrawing" xmlns:w10="urn:schemas-microsoft-com:office:word" xmlns:w="http://schemas.openxmlformats.org/wordprocessingml/2006/main" xmlns:w14="http://schemas.microsoft.com/office/word/2010/wordml" xmlns:w15="http://schemas.microsoft.com/office/word/2012/wordml" xmlns:w16cex="http://schemas.microsoft.com/office/word/2018/wordml/cex" xmlns:w16cid="http://schemas.microsoft.com/office/word/2016/wordml/cid" xmlns:w16="http://schemas.microsoft.com/office/word/2018/wordml" xmlns:w16du="http://schemas.microsoft.com/office/word/2023/wordml/word16du" xmlns:w16sdtdh="http://schemas.microsoft.com/office/word/2020/wordml/sdtdatahash" xmlns:w16sdtfl="http://schemas.microsoft.com/office/word/2024/wordml/sdtformatlock" xmlns:w16se="http://schemas.microsoft.com/office/word/2015/wordml/symex" xmlns:wpg="http://schemas.microsoft.com/office/word/2010/wordprocessingGroup" xmlns:wpi="http://schemas.microsoft.com/office/word/2010/wordprocessingInk" xmlns:wne="http://schemas.microsoft.com/office/word/2006/wordml" xmlns:wps="http://schemas.microsoft.com/office/word/2010/wordprocessingShape" mc:Ignorable="w14 w15 w16se w16cid w16 w16cex w16sdtdh w16sdtfl w16du wp14">
-  <w:p>
-    <w:pPr>
-      <w:pStyle w:val="Rodap"/>
-    </w:pPr>
-  </w:p>
-</w:ftr>
-</file>
-
 <file path=word/footnotes.xml><?xml version="1.0" encoding="utf-8"?>
 <w:footnotes xmlns:wpc="http://schemas.microsoft.com/office/word/2010/wordprocessingCanvas" xmlns:cx="http://schemas.microsoft.com/office/drawing/2014/chartex" xmlns:cx1="http://schemas.microsoft.com/office/drawing/2015/9/8/chartex" xmlns:cx2="http://schemas.microsoft.com/office/drawing/2015/10/21/chartex" xmlns:cx3="http://schemas.microsoft.com/office/drawing/2016/5/9/chartex" xmlns:cx4="http://schemas.microsoft.com/office/drawing/2016/5/10/chartex" xmlns:cx5="http://schemas.microsoft.com/office/drawing/2016/5/11/chartex" xmlns:cx6="http://schemas.microsoft.com/office/drawing/2016/5/12/chartex" xmlns:cx7="http://schemas.microsoft.com/office/drawing/2016/5/13/chartex" xmlns:cx8="http://schemas.microsoft.com/office/drawing/2016/5/14/chartex" xmlns:mc="http://schemas.openxmlformats.org/markup-compatibility/2006" xmlns:aink="http://schemas.microsoft.com/office/drawing/2016/ink" xmlns:am3d="http://schemas.microsoft.com/office/drawing/2017/model3d" xmlns:o="urn:schemas-microsoft-com:office:office" xmlns:oel="http://schemas.microsoft.com/office/2019/extlst" xmlns:r="http://schemas.openxmlformats.org/officeDocument/2006/relationships" xmlns:m="http://schemas.openxmlformats.org/officeDocument/2006/math" xmlns:v="urn:schemas-microsoft-com:vml" xmlns:wp14="http://schemas.microsoft.com/office/word/2010/wordprocessingDrawing" xmlns:wp="http://schemas.openxmlformats.org/drawingml/2006/wordprocessingDrawing" xmlns:w10="urn:schemas-microsoft-com:office:word" xmlns:w="http://schemas.openxmlformats.org/wordprocessingml/2006/main" xmlns:w14="http://schemas.microsoft.com/office/word/2010/wordml" xmlns:w15="http://schemas.microsoft.com/office/word/2012/wordml" xmlns:w16cex="http://schemas.microsoft.com/office/word/2018/wordml/cex" xmlns:w16cid="http://schemas.microsoft.com/office/word/2016/wordml/cid" xmlns:w16="http://schemas.microsoft.com/office/word/2018/wordml" xmlns:w16du="http://schemas.microsoft.com/office/word/2023/wordml/word16du" xmlns:w16sdtdh="http://schemas.microsoft.com/office/word/2020/wordml/sdtdatahash" xmlns:w16sdtfl="http://schemas.microsoft.com/office/word/2024/wordml/sdtformatlock" xmlns:w16se="http://schemas.microsoft.com/office/word/2015/wordml/symex" xmlns:wpg="http://schemas.microsoft.com/office/word/2010/wordprocessingGroup" xmlns:wpi="http://schemas.microsoft.com/office/word/2010/wordprocessingInk" xmlns:wne="http://schemas.microsoft.com/office/word/2006/wordml" xmlns:wps="http://schemas.microsoft.com/office/word/2010/wordprocessingShape" mc:Ignorable="w14 w15 w16se w16cid w16 w16cex w16sdtdh w16sdtfl w16du wp14">
   <w:footnote w:type="separator" w:id="-1">
@@ -1886,58 +1580,6 @@
   <w:p>
     <w:pPr>
       <w:pStyle w:val="Cabealho"/>
-    </w:pPr>
-  </w:p>
-</w:hdr>
-</file>
-
-<file path=word/header2.xml><?xml version="1.0" encoding="utf-8"?>
-<w:hdr xmlns:wpc="http://schemas.microsoft.com/office/word/2010/wordprocessingCanvas" xmlns:cx="http://schemas.microsoft.com/office/drawing/2014/chartex" xmlns:cx1="http://schemas.microsoft.com/office/drawing/2015/9/8/chartex" xmlns:cx2="http://schemas.microsoft.com/office/drawing/2015/10/21/chartex" xmlns:cx3="http://schemas.microsoft.com/office/drawing/2016/5/9/chartex" xmlns:cx4="http://schemas.microsoft.com/office/drawing/2016/5/10/chartex" xmlns:cx5="http://schemas.microsoft.com/office/drawing/2016/5/11/chartex" xmlns:cx6="http://schemas.microsoft.com/office/drawing/2016/5/12/chartex" xmlns:cx7="http://schemas.microsoft.com/office/drawing/2016/5/13/chartex" xmlns:cx8="http://schemas.microsoft.com/office/drawing/2016/5/14/chartex" xmlns:mc="http://schemas.openxmlformats.org/markup-compatibility/2006" xmlns:aink="http://schemas.microsoft.com/office/drawing/2016/ink" xmlns:am3d="http://schemas.microsoft.com/office/drawing/2017/model3d" xmlns:o="urn:schemas-microsoft-com:office:office" xmlns:oel="http://schemas.microsoft.com/office/2019/extlst" xmlns:r="http://schemas.openxmlformats.org/officeDocument/2006/relationships" xmlns:m="http://schemas.openxmlformats.org/officeDocument/2006/math" xmlns:v="urn:schemas-microsoft-com:vml" xmlns:wp14="http://schemas.microsoft.com/office/word/2010/wordprocessingDrawing" xmlns:wp="http://schemas.openxmlformats.org/drawingml/2006/wordprocessingDrawing" xmlns:w10="urn:schemas-microsoft-com:office:word" xmlns:w="http://schemas.openxmlformats.org/wordprocessingml/2006/main" xmlns:w14="http://schemas.microsoft.com/office/word/2010/wordml" xmlns:w15="http://schemas.microsoft.com/office/word/2012/wordml" xmlns:w16cex="http://schemas.microsoft.com/office/word/2018/wordml/cex" xmlns:w16cid="http://schemas.microsoft.com/office/word/2016/wordml/cid" xmlns:w16="http://schemas.microsoft.com/office/word/2018/wordml" xmlns:w16du="http://schemas.microsoft.com/office/word/2023/wordml/word16du" xmlns:w16sdtdh="http://schemas.microsoft.com/office/word/2020/wordml/sdtdatahash" xmlns:w16sdtfl="http://schemas.microsoft.com/office/word/2024/wordml/sdtformatlock" xmlns:w16se="http://schemas.microsoft.com/office/word/2015/wordml/symex" xmlns:wpg="http://schemas.microsoft.com/office/word/2010/wordprocessingGroup" xmlns:wpi="http://schemas.microsoft.com/office/word/2010/wordprocessingInk" xmlns:wne="http://schemas.microsoft.com/office/word/2006/wordml" xmlns:wps="http://schemas.microsoft.com/office/word/2010/wordprocessingShape" mc:Ignorable="w14 w15 w16se w16cid w16 w16cex w16sdtdh w16sdtfl w16du wp14">
-  <w:p>
-    <w:pPr>
-      <w:pStyle w:val="Cabealho"/>
-      <w:ind w:left="-567"/>
-      <w:rPr>
-        <w:rFonts w:ascii="Arial" w:hAnsi="Arial" w:cs="Arial"/>
-        <w:bCs/>
-        <w:i/>
-        <w:iCs/>
-        <w:sz w:val="20"/>
-      </w:rPr>
-    </w:pPr>
-    <w:r>
-      <w:rPr>
-        <w:rFonts w:ascii="Arial" w:hAnsi="Arial" w:cs="Arial"/>
-        <w:i/>
-        <w:iCs/>
-        <w:sz w:val="20"/>
-      </w:rPr>
-      <w:t>SEDE/DESSMA/PCG-0029-</w:t>
-    </w:r>
-    <w:r>
-      <w:rPr>
-        <w:rFonts w:ascii="Arial" w:hAnsi="Arial"/>
-        <w:bCs/>
-        <w:i/>
-        <w:iCs/>
-        <w:sz w:val="20"/>
-      </w:rPr>
-      <w:t>Procedimento de Avaliação de Desempenho e Elaboração do Plano de Desenvolvimento Individual (PDI)_Rev:0</w:t>
-    </w:r>
-    <w:r>
-      <w:rPr>
-        <w:rFonts w:ascii="Arial" w:hAnsi="Arial"/>
-        <w:bCs/>
-        <w:i/>
-        <w:iCs/>
-        <w:sz w:val="20"/>
-      </w:rPr>
-      <w:t>3</w:t>
-    </w:r>
-  </w:p>
-  <w:p>
-    <w:pPr>
-      <w:pStyle w:val="Cabealho"/>
       <w:ind w:left="-426" w:hanging="141"/>
       <w:rPr>
         <w:rFonts w:ascii="Arial" w:hAnsi="Arial" w:cs="Arial"/>
@@ -1946,20 +1588,11 @@
         <w:sz w:val="20"/>
       </w:rPr>
     </w:pPr>
-    <w:r>
-      <w:rPr>
-        <w:rFonts w:ascii="Arial" w:hAnsi="Arial" w:cs="Arial"/>
-        <w:i/>
-        <w:iCs/>
-        <w:sz w:val="20"/>
-      </w:rPr>
-      <w:t>Anexo 04 – Formulário de Avaliação de Eficácia das Ações de Desenvolvimento e Treinamento</w:t>
-    </w:r>
   </w:p>
   <w:tbl>
     <w:tblPr>
-      <w:tblW w:w="10490" w:type="dxa"/>
-      <w:tblInd w:w="-639" w:type="dxa"/>
+      <w:tblW w:w="8184" w:type="dxa"/>
+      <w:tblInd w:w="321" w:type="dxa"/>
       <w:tblCellMar>
         <w:left w:w="70" w:type="dxa"/>
         <w:right w:w="70" w:type="dxa"/>
@@ -1967,7 +1600,7 @@
       <w:tblLook w:val="04A0" w:firstRow="1" w:lastRow="0" w:firstColumn="1" w:lastColumn="0" w:noHBand="0" w:noVBand="1"/>
     </w:tblPr>
     <w:tblGrid>
-      <w:gridCol w:w="2472"/>
+      <w:gridCol w:w="166"/>
       <w:gridCol w:w="8018"/>
     </w:tblGrid>
     <w:tr>
@@ -1976,7 +1609,7 @@
       </w:trPr>
       <w:tc>
         <w:tcPr>
-          <w:tcW w:w="2472" w:type="dxa"/>
+          <w:tcW w:w="166" w:type="dxa"/>
           <w:vMerge w:val="restart"/>
           <w:tcBorders>
             <w:top w:val="single" w:sz="8" w:space="0" w:color="auto"/>
@@ -1994,64 +1627,6 @@
               <w:color w:val="000000"/>
             </w:rPr>
           </w:pPr>
-          <w:r>
-            <w:rPr>
-              <w:rFonts w:ascii="Calibri" w:hAnsi="Calibri" w:cs="Calibri"/>
-              <w:color w:val="000000"/>
-            </w:rPr>
-            <w:t xml:space="preserve"> </w:t>
-          </w:r>
-          <w:r>
-            <w:rPr>
-              <w:noProof/>
-            </w:rPr>
-            <w:drawing>
-              <wp:inline distT="0" distB="0" distL="0" distR="0" wp14:anchorId="4C5B6D47" wp14:editId="6A7C0D0A">
-                <wp:extent cx="1384935" cy="532765"/>
-                <wp:effectExtent l="0" t="0" r="5715" b="635"/>
-                <wp:docPr id="1807873365" name="Imagem 1807873365"/>
-                <wp:cNvGraphicFramePr/>
-                <a:graphic xmlns:a="http://schemas.openxmlformats.org/drawingml/2006/main">
-                  <a:graphicData uri="http://schemas.openxmlformats.org/drawingml/2006/picture">
-                    <pic:pic xmlns:pic="http://schemas.openxmlformats.org/drawingml/2006/picture">
-                      <pic:nvPicPr>
-                        <pic:cNvPr id="1807873365" name="Imagem 1807873365"/>
-                        <pic:cNvPicPr/>
-                      </pic:nvPicPr>
-                      <pic:blipFill>
-                        <a:blip r:embed="rId1">
-                          <a:extLst>
-                            <a:ext uri="{28A0092B-C50C-407E-A947-70E740481C1C}">
-                              <a14:useLocalDpi xmlns:a14="http://schemas.microsoft.com/office/drawing/2010/main" val="0"/>
-                            </a:ext>
-                          </a:extLst>
-                        </a:blip>
-                        <a:stretch>
-                          <a:fillRect/>
-                        </a:stretch>
-                      </pic:blipFill>
-                      <pic:spPr>
-                        <a:xfrm>
-                          <a:off x="0" y="0"/>
-                          <a:ext cx="1384935" cy="532765"/>
-                        </a:xfrm>
-                        <a:prstGeom prst="rect">
-                          <a:avLst/>
-                        </a:prstGeom>
-                      </pic:spPr>
-                    </pic:pic>
-                  </a:graphicData>
-                </a:graphic>
-              </wp:inline>
-            </w:drawing>
-          </w:r>
-          <w:r>
-            <w:rPr>
-              <w:rFonts w:ascii="Calibri" w:hAnsi="Calibri" w:cs="Calibri"/>
-              <w:color w:val="000000"/>
-            </w:rPr>
-            <w:t> </w:t>
-          </w:r>
         </w:p>
       </w:tc>
       <w:tc>
@@ -2082,7 +1657,7 @@
               <w:b/>
               <w:sz w:val="22"/>
             </w:rPr>
-            <w:t>AVALIAÇÃO DE EFICÁCIA DE AÇÃO DE DESENVOLVIMENTO</w:t>
+            <w:t>AVALIAÇÃO DE DESENVOLVIMENTO</w:t>
           </w:r>
         </w:p>
         <w:p>
@@ -2112,7 +1687,7 @@
       </w:trPr>
       <w:tc>
         <w:tcPr>
-          <w:tcW w:w="2472" w:type="dxa"/>
+          <w:tcW w:w="166" w:type="dxa"/>
           <w:vMerge/>
           <w:tcBorders>
             <w:top w:val="single" w:sz="8" w:space="0" w:color="auto"/>
@@ -2156,16 +1731,6 @@
       </w:tc>
     </w:tr>
   </w:tbl>
-  <w:p>
-    <w:pPr>
-      <w:pStyle w:val="Cabealho"/>
-    </w:pPr>
-  </w:p>
-</w:hdr>
-</file>
-
-<file path=word/header3.xml><?xml version="1.0" encoding="utf-8"?>
-<w:hdr xmlns:wpc="http://schemas.microsoft.com/office/word/2010/wordprocessingCanvas" xmlns:cx="http://schemas.microsoft.com/office/drawing/2014/chartex" xmlns:cx1="http://schemas.microsoft.com/office/drawing/2015/9/8/chartex" xmlns:cx2="http://schemas.microsoft.com/office/drawing/2015/10/21/chartex" xmlns:cx3="http://schemas.microsoft.com/office/drawing/2016/5/9/chartex" xmlns:cx4="http://schemas.microsoft.com/office/drawing/2016/5/10/chartex" xmlns:cx5="http://schemas.microsoft.com/office/drawing/2016/5/11/chartex" xmlns:cx6="http://schemas.microsoft.com/office/drawing/2016/5/12/chartex" xmlns:cx7="http://schemas.microsoft.com/office/drawing/2016/5/13/chartex" xmlns:cx8="http://schemas.microsoft.com/office/drawing/2016/5/14/chartex" xmlns:mc="http://schemas.openxmlformats.org/markup-compatibility/2006" xmlns:aink="http://schemas.microsoft.com/office/drawing/2016/ink" xmlns:am3d="http://schemas.microsoft.com/office/drawing/2017/model3d" xmlns:o="urn:schemas-microsoft-com:office:office" xmlns:oel="http://schemas.microsoft.com/office/2019/extlst" xmlns:r="http://schemas.openxmlformats.org/officeDocument/2006/relationships" xmlns:m="http://schemas.openxmlformats.org/officeDocument/2006/math" xmlns:v="urn:schemas-microsoft-com:vml" xmlns:wp14="http://schemas.microsoft.com/office/word/2010/wordprocessingDrawing" xmlns:wp="http://schemas.openxmlformats.org/drawingml/2006/wordprocessingDrawing" xmlns:w10="urn:schemas-microsoft-com:office:word" xmlns:w="http://schemas.openxmlformats.org/wordprocessingml/2006/main" xmlns:w14="http://schemas.microsoft.com/office/word/2010/wordml" xmlns:w15="http://schemas.microsoft.com/office/word/2012/wordml" xmlns:w16cex="http://schemas.microsoft.com/office/word/2018/wordml/cex" xmlns:w16cid="http://schemas.microsoft.com/office/word/2016/wordml/cid" xmlns:w16="http://schemas.microsoft.com/office/word/2018/wordml" xmlns:w16du="http://schemas.microsoft.com/office/word/2023/wordml/word16du" xmlns:w16sdtdh="http://schemas.microsoft.com/office/word/2020/wordml/sdtdatahash" xmlns:w16sdtfl="http://schemas.microsoft.com/office/word/2024/wordml/sdtformatlock" xmlns:w16se="http://schemas.microsoft.com/office/word/2015/wordml/symex" xmlns:wpg="http://schemas.microsoft.com/office/word/2010/wordprocessingGroup" xmlns:wpi="http://schemas.microsoft.com/office/word/2010/wordprocessingInk" xmlns:wne="http://schemas.microsoft.com/office/word/2006/wordml" xmlns:wps="http://schemas.microsoft.com/office/word/2010/wordprocessingShape" mc:Ignorable="w14 w15 w16se w16cid w16 w16cex w16sdtdh w16sdtfl w16du wp14">
   <w:p>
     <w:pPr>
       <w:pStyle w:val="Cabealho"/>
@@ -2730,6 +2295,7 @@
   <w:style w:type="character" w:default="1" w:styleId="Fontepargpadro">
     <w:name w:val="Default Paragraph Font"/>
     <w:uiPriority w:val="1"/>
+    <w:semiHidden/>
     <w:unhideWhenUsed/>
   </w:style>
   <w:style w:type="table" w:default="1" w:styleId="Tabelanormal">
@@ -3128,10 +2694,26 @@
 </file>
 
 <file path=customXml/item1.xml><?xml version="1.0" encoding="utf-8"?>
-<b:Sources xmlns:b="http://schemas.openxmlformats.org/officeDocument/2006/bibliography" xmlns="http://schemas.openxmlformats.org/officeDocument/2006/bibliography" SelectedStyle="\APA.XSL" StyleName="APA"/>
+<p:properties xmlns:p="http://schemas.microsoft.com/office/2006/metadata/properties" xmlns:xsi="http://www.w3.org/2001/XMLSchema-instance" xmlns:pc="http://schemas.microsoft.com/office/infopath/2007/PartnerControls">
+  <documentManagement>
+    <TaxCatchAll xmlns="8ce85121-1413-4f14-bfd2-4597b976263c" xsi:nil="true"/>
+    <lcf76f155ced4ddcb4097134ff3c332f xmlns="f1b78feb-36eb-4c7e-a2f1-0716b6709973">
+      <Terms xmlns="http://schemas.microsoft.com/office/infopath/2007/PartnerControls"/>
+    </lcf76f155ced4ddcb4097134ff3c332f>
+  </documentManagement>
+</p:properties>
 </file>
 
 <file path=customXml/item2.xml><?xml version="1.0" encoding="utf-8"?>
+<?mso-contentType ?>
+<FormTemplates xmlns="http://schemas.microsoft.com/sharepoint/v3/contenttype/forms">
+  <Display>DocumentLibraryForm</Display>
+  <Edit>DocumentLibraryForm</Edit>
+  <New>DocumentLibraryForm</New>
+</FormTemplates>
+</file>
+
+<file path=customXml/item3.xml><?xml version="1.0" encoding="utf-8"?>
 <ct:contentTypeSchema xmlns:ct="http://schemas.microsoft.com/office/2006/metadata/contentType" xmlns:ma="http://schemas.microsoft.com/office/2006/metadata/properties/metaAttributes" ct:_="" ma:_="" ma:contentTypeName="Documento" ma:contentTypeID="0x0101001662EAAED141C745B259D38045147B91" ma:contentTypeVersion="10" ma:contentTypeDescription="Crie um novo documento." ma:contentTypeScope="" ma:versionID="1a624b5cd605e3aafbc5adb651030010">
   <xsd:schema xmlns:xsd="http://www.w3.org/2001/XMLSchema" xmlns:xs="http://www.w3.org/2001/XMLSchema" xmlns:p="http://schemas.microsoft.com/office/2006/metadata/properties" xmlns:ns2="f1b78feb-36eb-4c7e-a2f1-0716b6709973" xmlns:ns3="8ce85121-1413-4f14-bfd2-4597b976263c" targetNamespace="http://schemas.microsoft.com/office/2006/metadata/properties" ma:root="true" ma:fieldsID="943e7de6c3daa61f39d999c7fe34f4f5" ns2:_="" ns3:_="">
     <xsd:import namespace="f1b78feb-36eb-4c7e-a2f1-0716b6709973"/>
@@ -3320,35 +2902,30 @@
 </ct:contentTypeSchema>
 </file>
 
-<file path=customXml/item3.xml><?xml version="1.0" encoding="utf-8"?>
-<?mso-contentType ?>
-<FormTemplates xmlns="http://schemas.microsoft.com/sharepoint/v3/contenttype/forms">
-  <Display>DocumentLibraryForm</Display>
-  <Edit>DocumentLibraryForm</Edit>
-  <New>DocumentLibraryForm</New>
-</FormTemplates>
-</file>
-
 <file path=customXml/item4.xml><?xml version="1.0" encoding="utf-8"?>
-<p:properties xmlns:p="http://schemas.microsoft.com/office/2006/metadata/properties" xmlns:xsi="http://www.w3.org/2001/XMLSchema-instance" xmlns:pc="http://schemas.microsoft.com/office/infopath/2007/PartnerControls">
-  <documentManagement>
-    <TaxCatchAll xmlns="8ce85121-1413-4f14-bfd2-4597b976263c" xsi:nil="true"/>
-    <lcf76f155ced4ddcb4097134ff3c332f xmlns="f1b78feb-36eb-4c7e-a2f1-0716b6709973">
-      <Terms xmlns="http://schemas.microsoft.com/office/infopath/2007/PartnerControls"/>
-    </lcf76f155ced4ddcb4097134ff3c332f>
-  </documentManagement>
-</p:properties>
+<b:Sources xmlns:b="http://schemas.openxmlformats.org/officeDocument/2006/bibliography" xmlns="http://schemas.openxmlformats.org/officeDocument/2006/bibliography" SelectedStyle="\APA.XSL" StyleName="APA"/>
 </file>
 
 <file path=customXml/itemProps1.xml><?xml version="1.0" encoding="utf-8"?>
-<ds:datastoreItem xmlns:ds="http://schemas.openxmlformats.org/officeDocument/2006/customXml" ds:itemID="{C731588C-9DF0-4D05-B49B-7A1445CD618B}">
+<ds:datastoreItem xmlns:ds="http://schemas.openxmlformats.org/officeDocument/2006/customXml" ds:itemID="{FB32E176-3977-4E36-B374-CD9784BBE0F6}">
   <ds:schemaRefs>
-    <ds:schemaRef ds:uri="http://schemas.openxmlformats.org/officeDocument/2006/bibliography"/>
+    <ds:schemaRef ds:uri="http://schemas.microsoft.com/office/2006/metadata/properties"/>
+    <ds:schemaRef ds:uri="http://schemas.microsoft.com/office/infopath/2007/PartnerControls"/>
+    <ds:schemaRef ds:uri="8ce85121-1413-4f14-bfd2-4597b976263c"/>
+    <ds:schemaRef ds:uri="f1b78feb-36eb-4c7e-a2f1-0716b6709973"/>
   </ds:schemaRefs>
 </ds:datastoreItem>
 </file>
 
 <file path=customXml/itemProps2.xml><?xml version="1.0" encoding="utf-8"?>
+<ds:datastoreItem xmlns:ds="http://schemas.openxmlformats.org/officeDocument/2006/customXml" ds:itemID="{A61C26BA-5A34-4D2D-A0FA-0709C0B107A6}">
+  <ds:schemaRefs>
+    <ds:schemaRef ds:uri="http://schemas.microsoft.com/sharepoint/v3/contenttype/forms"/>
+  </ds:schemaRefs>
+</ds:datastoreItem>
+</file>
+
+<file path=customXml/itemProps3.xml><?xml version="1.0" encoding="utf-8"?>
 <ds:datastoreItem xmlns:ds="http://schemas.openxmlformats.org/officeDocument/2006/customXml" ds:itemID="{067EE9B6-4F86-4F45-870E-FF31330BB646}">
   <ds:schemaRefs>
     <ds:schemaRef ds:uri="http://schemas.microsoft.com/office/2006/metadata/contentType"/>
@@ -3367,21 +2944,10 @@
 </ds:datastoreItem>
 </file>
 
-<file path=customXml/itemProps3.xml><?xml version="1.0" encoding="utf-8"?>
-<ds:datastoreItem xmlns:ds="http://schemas.openxmlformats.org/officeDocument/2006/customXml" ds:itemID="{A61C26BA-5A34-4D2D-A0FA-0709C0B107A6}">
+<file path=customXml/itemProps4.xml><?xml version="1.0" encoding="utf-8"?>
+<ds:datastoreItem xmlns:ds="http://schemas.openxmlformats.org/officeDocument/2006/customXml" ds:itemID="{C731588C-9DF0-4D05-B49B-7A1445CD618B}">
   <ds:schemaRefs>
-    <ds:schemaRef ds:uri="http://schemas.microsoft.com/sharepoint/v3/contenttype/forms"/>
-  </ds:schemaRefs>
-</ds:datastoreItem>
-</file>
-
-<file path=customXml/itemProps4.xml><?xml version="1.0" encoding="utf-8"?>
-<ds:datastoreItem xmlns:ds="http://schemas.openxmlformats.org/officeDocument/2006/customXml" ds:itemID="{FB32E176-3977-4E36-B374-CD9784BBE0F6}">
-  <ds:schemaRefs>
-    <ds:schemaRef ds:uri="http://schemas.microsoft.com/office/2006/metadata/properties"/>
-    <ds:schemaRef ds:uri="http://schemas.microsoft.com/office/infopath/2007/PartnerControls"/>
-    <ds:schemaRef ds:uri="8ce85121-1413-4f14-bfd2-4597b976263c"/>
-    <ds:schemaRef ds:uri="f1b78feb-36eb-4c7e-a2f1-0716b6709973"/>
+    <ds:schemaRef ds:uri="http://schemas.openxmlformats.org/officeDocument/2006/bibliography"/>
   </ds:schemaRefs>
 </ds:datastoreItem>
 </file>
</xml_diff>